<commit_message>
fix(thesis): 修复 Word 打不开——sectPr 子元素顺序违反 schema
作者反馈 Word 报 "Word experienced an error trying to open the file"。
根因：postprocess-docx.py 组装的 <w:sectPr> 把 <w:pgNumType> 放在了
</w:docGrid> 之后，而 CT_SectPr 规定序列为
  headerReference* → footerReference* → pgSz → pgMar → pgBorders
  → pgNumType → cols → docGrid
（以北航样例中 Word 原生生成的 sectPr 为准）。Word 会严格校验并拒绝打开；
LibreOffice 与 python-docx 都能打开，所以此前的 zip/XML/rId 检查没发现。

同时把页眉页脚的命名空间声明改为与样例中 Word 原生部件一致（完整
wpc/mc/o/r/m/v/wp14/wp10/w14/w15/... 声明），减少版本差异带来的风险。

校验（本次新增两项）：
- 逐节比对 sectPr 子元素顺序与样例一致
- pandoc 回读 docx 成功（能解析出正文）
- 与未后处理的 pandoc 原始输出做元素序列 diff：仅新增 sectPr/headerReference/
  footerReference 与目录移位，无其它结构性改动
- 提交后核对 git blob md5 与本地文件一致，排除 git 侧损坏

AGENT-GUIDE §0 已登记"导出版式校验下限"。
</commit_message>
<xml_diff>
--- a/docs/thesis/thesis-beihang.docx
+++ b/docs/thesis/thesis-beihang.docx
@@ -755,9 +755,9 @@
             <w:bottom w:space="0" w:sz="0" w:val="none"/>
             <w:right w:space="0" w:sz="0" w:val="none"/>
           </w:pgBorders>
+          <w:pgNumType w:fmt="upperRoman" w:start="1"/>
           <w:cols w:num="1" w:space="425"/>
           <w:docGrid w:charSpace="0" w:linePitch="312" w:type="linesAndChars"/>
-          <w:pgNumType w:fmt="upperRoman" w:start="1"/>
         </w:sectPr>
       </w:pPr>
       <w:r>
@@ -3047,9 +3047,9 @@
             <w:bottom w:space="0" w:sz="0" w:val="none"/>
             <w:right w:space="0" w:sz="0" w:val="none"/>
           </w:pgBorders>
+          <w:pgNumType w:fmt="decimal" w:start="1"/>
           <w:cols w:num="1" w:space="425"/>
           <w:docGrid w:charSpace="0" w:linePitch="312" w:type="linesAndChars"/>
-          <w:pgNumType w:fmt="decimal" w:start="1"/>
         </w:sectPr>
       </w:pPr>
       <w:r>
@@ -61603,7 +61603,7 @@
 </file>
 
 <file path=word/footer_pp_page.xml><?xml version="1.0" encoding="utf-8"?>
-<w:ftr xmlns:w="http://schemas.openxmlformats.org/wordprocessingml/2006/main" xmlns:r="http://schemas.openxmlformats.org/officeDocument/2006/relationships">
+<w:ftr xmlns:wpc="http://schemas.microsoft.com/office/word/2010/wordprocessingCanvas" xmlns:mc="http://schemas.openxmlformats.org/markup-compatibility/2006" xmlns:o="urn:schemas-microsoft-com:office:office" xmlns:r="http://schemas.openxmlformats.org/officeDocument/2006/relationships" xmlns:m="http://schemas.openxmlformats.org/officeDocument/2006/math" xmlns:v="urn:schemas-microsoft-com:vml" xmlns:wp14="http://schemas.microsoft.com/office/word/2010/wordprocessingDrawing" xmlns:wp="http://schemas.openxmlformats.org/drawingml/2006/wordprocessingDrawing" xmlns:w10="urn:schemas-microsoft-com:office:word" xmlns:w="http://schemas.openxmlformats.org/wordprocessingml/2006/main" xmlns:w14="http://schemas.microsoft.com/office/word/2010/wordml" xmlns:w15="http://schemas.microsoft.com/office/word/2012/wordml" xmlns:wpg="http://schemas.microsoft.com/office/word/2010/wordprocessingGroup" xmlns:wpi="http://schemas.microsoft.com/office/word/2010/wordprocessingInk" xmlns:wne="http://schemas.microsoft.com/office/word/2006/wordml" xmlns:wps="http://schemas.microsoft.com/office/word/2010/wordprocessingShape">
   <w:p>
     <w:pPr>
       <w:jc w:val="center"/>
@@ -61669,7 +61669,7 @@
 </file>
 
 <file path=word/header_pp_ch2.xml><?xml version="1.0" encoding="utf-8"?>
-<w:hdr xmlns:w="http://schemas.openxmlformats.org/wordprocessingml/2006/main" xmlns:r="http://schemas.openxmlformats.org/officeDocument/2006/relationships">
+<w:hdr xmlns:wpc="http://schemas.microsoft.com/office/word/2010/wordprocessingCanvas" xmlns:mc="http://schemas.openxmlformats.org/markup-compatibility/2006" xmlns:o="urn:schemas-microsoft-com:office:office" xmlns:r="http://schemas.openxmlformats.org/officeDocument/2006/relationships" xmlns:m="http://schemas.openxmlformats.org/officeDocument/2006/math" xmlns:v="urn:schemas-microsoft-com:vml" xmlns:wp14="http://schemas.microsoft.com/office/word/2010/wordprocessingDrawing" xmlns:wp="http://schemas.openxmlformats.org/drawingml/2006/wordprocessingDrawing" xmlns:w10="urn:schemas-microsoft-com:office:word" xmlns:w="http://schemas.openxmlformats.org/wordprocessingml/2006/main" xmlns:w14="http://schemas.microsoft.com/office/word/2010/wordml" xmlns:w15="http://schemas.microsoft.com/office/word/2012/wordml" xmlns:wpg="http://schemas.microsoft.com/office/word/2010/wordprocessingGroup" xmlns:wpi="http://schemas.microsoft.com/office/word/2010/wordprocessingInk" xmlns:wne="http://schemas.microsoft.com/office/word/2006/wordml" xmlns:wps="http://schemas.microsoft.com/office/word/2010/wordprocessingShape">
   <w:p>
     <w:pPr>
       <w:jc w:val="center"/>
@@ -61692,7 +61692,7 @@
 </file>
 
 <file path=word/header_pp_ch3.xml><?xml version="1.0" encoding="utf-8"?>
-<w:hdr xmlns:w="http://schemas.openxmlformats.org/wordprocessingml/2006/main" xmlns:r="http://schemas.openxmlformats.org/officeDocument/2006/relationships">
+<w:hdr xmlns:wpc="http://schemas.microsoft.com/office/word/2010/wordprocessingCanvas" xmlns:mc="http://schemas.openxmlformats.org/markup-compatibility/2006" xmlns:o="urn:schemas-microsoft-com:office:office" xmlns:r="http://schemas.openxmlformats.org/officeDocument/2006/relationships" xmlns:m="http://schemas.openxmlformats.org/officeDocument/2006/math" xmlns:v="urn:schemas-microsoft-com:vml" xmlns:wp14="http://schemas.microsoft.com/office/word/2010/wordprocessingDrawing" xmlns:wp="http://schemas.openxmlformats.org/drawingml/2006/wordprocessingDrawing" xmlns:w10="urn:schemas-microsoft-com:office:word" xmlns:w="http://schemas.openxmlformats.org/wordprocessingml/2006/main" xmlns:w14="http://schemas.microsoft.com/office/word/2010/wordml" xmlns:w15="http://schemas.microsoft.com/office/word/2012/wordml" xmlns:wpg="http://schemas.microsoft.com/office/word/2010/wordprocessingGroup" xmlns:wpi="http://schemas.microsoft.com/office/word/2010/wordprocessingInk" xmlns:wne="http://schemas.microsoft.com/office/word/2006/wordml" xmlns:wps="http://schemas.microsoft.com/office/word/2010/wordprocessingShape">
   <w:p>
     <w:pPr>
       <w:jc w:val="center"/>
@@ -61715,7 +61715,7 @@
 </file>
 
 <file path=word/header_pp_ch4.xml><?xml version="1.0" encoding="utf-8"?>
-<w:hdr xmlns:w="http://schemas.openxmlformats.org/wordprocessingml/2006/main" xmlns:r="http://schemas.openxmlformats.org/officeDocument/2006/relationships">
+<w:hdr xmlns:wpc="http://schemas.microsoft.com/office/word/2010/wordprocessingCanvas" xmlns:mc="http://schemas.openxmlformats.org/markup-compatibility/2006" xmlns:o="urn:schemas-microsoft-com:office:office" xmlns:r="http://schemas.openxmlformats.org/officeDocument/2006/relationships" xmlns:m="http://schemas.openxmlformats.org/officeDocument/2006/math" xmlns:v="urn:schemas-microsoft-com:vml" xmlns:wp14="http://schemas.microsoft.com/office/word/2010/wordprocessingDrawing" xmlns:wp="http://schemas.openxmlformats.org/drawingml/2006/wordprocessingDrawing" xmlns:w10="urn:schemas-microsoft-com:office:word" xmlns:w="http://schemas.openxmlformats.org/wordprocessingml/2006/main" xmlns:w14="http://schemas.microsoft.com/office/word/2010/wordml" xmlns:w15="http://schemas.microsoft.com/office/word/2012/wordml" xmlns:wpg="http://schemas.microsoft.com/office/word/2010/wordprocessingGroup" xmlns:wpi="http://schemas.microsoft.com/office/word/2010/wordprocessingInk" xmlns:wne="http://schemas.microsoft.com/office/word/2006/wordml" xmlns:wps="http://schemas.microsoft.com/office/word/2010/wordprocessingShape">
   <w:p>
     <w:pPr>
       <w:jc w:val="center"/>
@@ -61738,7 +61738,7 @@
 </file>
 
 <file path=word/header_pp_ch5.xml><?xml version="1.0" encoding="utf-8"?>
-<w:hdr xmlns:w="http://schemas.openxmlformats.org/wordprocessingml/2006/main" xmlns:r="http://schemas.openxmlformats.org/officeDocument/2006/relationships">
+<w:hdr xmlns:wpc="http://schemas.microsoft.com/office/word/2010/wordprocessingCanvas" xmlns:mc="http://schemas.openxmlformats.org/markup-compatibility/2006" xmlns:o="urn:schemas-microsoft-com:office:office" xmlns:r="http://schemas.openxmlformats.org/officeDocument/2006/relationships" xmlns:m="http://schemas.openxmlformats.org/officeDocument/2006/math" xmlns:v="urn:schemas-microsoft-com:vml" xmlns:wp14="http://schemas.microsoft.com/office/word/2010/wordprocessingDrawing" xmlns:wp="http://schemas.openxmlformats.org/drawingml/2006/wordprocessingDrawing" xmlns:w10="urn:schemas-microsoft-com:office:word" xmlns:w="http://schemas.openxmlformats.org/wordprocessingml/2006/main" xmlns:w14="http://schemas.microsoft.com/office/word/2010/wordml" xmlns:w15="http://schemas.microsoft.com/office/word/2012/wordml" xmlns:wpg="http://schemas.microsoft.com/office/word/2010/wordprocessingGroup" xmlns:wpi="http://schemas.microsoft.com/office/word/2010/wordprocessingInk" xmlns:wne="http://schemas.microsoft.com/office/word/2006/wordml" xmlns:wps="http://schemas.microsoft.com/office/word/2010/wordprocessingShape">
   <w:p>
     <w:pPr>
       <w:jc w:val="center"/>
@@ -61761,7 +61761,7 @@
 </file>
 
 <file path=word/header_pp_ch6.xml><?xml version="1.0" encoding="utf-8"?>
-<w:hdr xmlns:w="http://schemas.openxmlformats.org/wordprocessingml/2006/main" xmlns:r="http://schemas.openxmlformats.org/officeDocument/2006/relationships">
+<w:hdr xmlns:wpc="http://schemas.microsoft.com/office/word/2010/wordprocessingCanvas" xmlns:mc="http://schemas.openxmlformats.org/markup-compatibility/2006" xmlns:o="urn:schemas-microsoft-com:office:office" xmlns:r="http://schemas.openxmlformats.org/officeDocument/2006/relationships" xmlns:m="http://schemas.openxmlformats.org/officeDocument/2006/math" xmlns:v="urn:schemas-microsoft-com:vml" xmlns:wp14="http://schemas.microsoft.com/office/word/2010/wordprocessingDrawing" xmlns:wp="http://schemas.openxmlformats.org/drawingml/2006/wordprocessingDrawing" xmlns:w10="urn:schemas-microsoft-com:office:word" xmlns:w="http://schemas.openxmlformats.org/wordprocessingml/2006/main" xmlns:w14="http://schemas.microsoft.com/office/word/2010/wordml" xmlns:w15="http://schemas.microsoft.com/office/word/2012/wordml" xmlns:wpg="http://schemas.microsoft.com/office/word/2010/wordprocessingGroup" xmlns:wpi="http://schemas.microsoft.com/office/word/2010/wordprocessingInk" xmlns:wne="http://schemas.microsoft.com/office/word/2006/wordml" xmlns:wps="http://schemas.microsoft.com/office/word/2010/wordprocessingShape">
   <w:p>
     <w:pPr>
       <w:jc w:val="center"/>
@@ -61784,7 +61784,7 @@
 </file>
 
 <file path=word/header_pp_ch7.xml><?xml version="1.0" encoding="utf-8"?>
-<w:hdr xmlns:w="http://schemas.openxmlformats.org/wordprocessingml/2006/main" xmlns:r="http://schemas.openxmlformats.org/officeDocument/2006/relationships">
+<w:hdr xmlns:wpc="http://schemas.microsoft.com/office/word/2010/wordprocessingCanvas" xmlns:mc="http://schemas.openxmlformats.org/markup-compatibility/2006" xmlns:o="urn:schemas-microsoft-com:office:office" xmlns:r="http://schemas.openxmlformats.org/officeDocument/2006/relationships" xmlns:m="http://schemas.openxmlformats.org/officeDocument/2006/math" xmlns:v="urn:schemas-microsoft-com:vml" xmlns:wp14="http://schemas.microsoft.com/office/word/2010/wordprocessingDrawing" xmlns:wp="http://schemas.openxmlformats.org/drawingml/2006/wordprocessingDrawing" xmlns:w10="urn:schemas-microsoft-com:office:word" xmlns:w="http://schemas.openxmlformats.org/wordprocessingml/2006/main" xmlns:w14="http://schemas.microsoft.com/office/word/2010/wordml" xmlns:w15="http://schemas.microsoft.com/office/word/2012/wordml" xmlns:wpg="http://schemas.microsoft.com/office/word/2010/wordprocessingGroup" xmlns:wpi="http://schemas.microsoft.com/office/word/2010/wordprocessingInk" xmlns:wne="http://schemas.microsoft.com/office/word/2006/wordml" xmlns:wps="http://schemas.microsoft.com/office/word/2010/wordprocessingShape">
   <w:p>
     <w:pPr>
       <w:jc w:val="center"/>
@@ -61807,7 +61807,7 @@
 </file>
 
 <file path=word/header_pp_ch8.xml><?xml version="1.0" encoding="utf-8"?>
-<w:hdr xmlns:w="http://schemas.openxmlformats.org/wordprocessingml/2006/main" xmlns:r="http://schemas.openxmlformats.org/officeDocument/2006/relationships">
+<w:hdr xmlns:wpc="http://schemas.microsoft.com/office/word/2010/wordprocessingCanvas" xmlns:mc="http://schemas.openxmlformats.org/markup-compatibility/2006" xmlns:o="urn:schemas-microsoft-com:office:office" xmlns:r="http://schemas.openxmlformats.org/officeDocument/2006/relationships" xmlns:m="http://schemas.openxmlformats.org/officeDocument/2006/math" xmlns:v="urn:schemas-microsoft-com:vml" xmlns:wp14="http://schemas.microsoft.com/office/word/2010/wordprocessingDrawing" xmlns:wp="http://schemas.openxmlformats.org/drawingml/2006/wordprocessingDrawing" xmlns:w10="urn:schemas-microsoft-com:office:word" xmlns:w="http://schemas.openxmlformats.org/wordprocessingml/2006/main" xmlns:w14="http://schemas.microsoft.com/office/word/2010/wordml" xmlns:w15="http://schemas.microsoft.com/office/word/2012/wordml" xmlns:wpg="http://schemas.microsoft.com/office/word/2010/wordprocessingGroup" xmlns:wpi="http://schemas.microsoft.com/office/word/2010/wordprocessingInk" xmlns:wne="http://schemas.microsoft.com/office/word/2006/wordml" xmlns:wps="http://schemas.microsoft.com/office/word/2010/wordprocessingShape">
   <w:p>
     <w:pPr>
       <w:jc w:val="center"/>
@@ -61830,7 +61830,7 @@
 </file>
 
 <file path=word/header_pp_odd.xml><?xml version="1.0" encoding="utf-8"?>
-<w:hdr xmlns:w="http://schemas.openxmlformats.org/wordprocessingml/2006/main" xmlns:r="http://schemas.openxmlformats.org/officeDocument/2006/relationships">
+<w:hdr xmlns:wpc="http://schemas.microsoft.com/office/word/2010/wordprocessingCanvas" xmlns:mc="http://schemas.openxmlformats.org/markup-compatibility/2006" xmlns:o="urn:schemas-microsoft-com:office:office" xmlns:r="http://schemas.openxmlformats.org/officeDocument/2006/relationships" xmlns:m="http://schemas.openxmlformats.org/officeDocument/2006/math" xmlns:v="urn:schemas-microsoft-com:vml" xmlns:wp14="http://schemas.microsoft.com/office/word/2010/wordprocessingDrawing" xmlns:wp="http://schemas.openxmlformats.org/drawingml/2006/wordprocessingDrawing" xmlns:w10="urn:schemas-microsoft-com:office:word" xmlns:w="http://schemas.openxmlformats.org/wordprocessingml/2006/main" xmlns:w14="http://schemas.microsoft.com/office/word/2010/wordml" xmlns:w15="http://schemas.microsoft.com/office/word/2012/wordml" xmlns:wpg="http://schemas.microsoft.com/office/word/2010/wordprocessingGroup" xmlns:wpi="http://schemas.microsoft.com/office/word/2010/wordprocessingInk" xmlns:wne="http://schemas.microsoft.com/office/word/2006/wordml" xmlns:wps="http://schemas.microsoft.com/office/word/2010/wordprocessingShape">
   <w:p>
     <w:pPr>
       <w:jc w:val="center"/>
@@ -61853,7 +61853,7 @@
 </file>
 
 <file path=word/header_pp_same10.xml><?xml version="1.0" encoding="utf-8"?>
-<w:hdr xmlns:w="http://schemas.openxmlformats.org/wordprocessingml/2006/main" xmlns:r="http://schemas.openxmlformats.org/officeDocument/2006/relationships">
+<w:hdr xmlns:wpc="http://schemas.microsoft.com/office/word/2010/wordprocessingCanvas" xmlns:mc="http://schemas.openxmlformats.org/markup-compatibility/2006" xmlns:o="urn:schemas-microsoft-com:office:office" xmlns:r="http://schemas.openxmlformats.org/officeDocument/2006/relationships" xmlns:m="http://schemas.openxmlformats.org/officeDocument/2006/math" xmlns:v="urn:schemas-microsoft-com:vml" xmlns:wp14="http://schemas.microsoft.com/office/word/2010/wordprocessingDrawing" xmlns:wp="http://schemas.openxmlformats.org/drawingml/2006/wordprocessingDrawing" xmlns:w10="urn:schemas-microsoft-com:office:word" xmlns:w="http://schemas.openxmlformats.org/wordprocessingml/2006/main" xmlns:w14="http://schemas.microsoft.com/office/word/2010/wordml" xmlns:w15="http://schemas.microsoft.com/office/word/2012/wordml" xmlns:wpg="http://schemas.microsoft.com/office/word/2010/wordprocessingGroup" xmlns:wpi="http://schemas.microsoft.com/office/word/2010/wordprocessingInk" xmlns:wne="http://schemas.microsoft.com/office/word/2006/wordml" xmlns:wps="http://schemas.microsoft.com/office/word/2010/wordprocessingShape">
   <w:p>
     <w:pPr>
       <w:jc w:val="center"/>
@@ -61876,7 +61876,7 @@
 </file>
 
 <file path=word/header_pp_same11.xml><?xml version="1.0" encoding="utf-8"?>
-<w:hdr xmlns:w="http://schemas.openxmlformats.org/wordprocessingml/2006/main" xmlns:r="http://schemas.openxmlformats.org/officeDocument/2006/relationships">
+<w:hdr xmlns:wpc="http://schemas.microsoft.com/office/word/2010/wordprocessingCanvas" xmlns:mc="http://schemas.openxmlformats.org/markup-compatibility/2006" xmlns:o="urn:schemas-microsoft-com:office:office" xmlns:r="http://schemas.openxmlformats.org/officeDocument/2006/relationships" xmlns:m="http://schemas.openxmlformats.org/officeDocument/2006/math" xmlns:v="urn:schemas-microsoft-com:vml" xmlns:wp14="http://schemas.microsoft.com/office/word/2010/wordprocessingDrawing" xmlns:wp="http://schemas.openxmlformats.org/drawingml/2006/wordprocessingDrawing" xmlns:w10="urn:schemas-microsoft-com:office:word" xmlns:w="http://schemas.openxmlformats.org/wordprocessingml/2006/main" xmlns:w14="http://schemas.microsoft.com/office/word/2010/wordml" xmlns:w15="http://schemas.microsoft.com/office/word/2012/wordml" xmlns:wpg="http://schemas.microsoft.com/office/word/2010/wordprocessingGroup" xmlns:wpi="http://schemas.microsoft.com/office/word/2010/wordprocessingInk" xmlns:wne="http://schemas.microsoft.com/office/word/2006/wordml" xmlns:wps="http://schemas.microsoft.com/office/word/2010/wordprocessingShape">
   <w:p>
     <w:pPr>
       <w:jc w:val="center"/>
@@ -61899,7 +61899,7 @@
 </file>
 
 <file path=word/header_pp_same9.xml><?xml version="1.0" encoding="utf-8"?>
-<w:hdr xmlns:w="http://schemas.openxmlformats.org/wordprocessingml/2006/main" xmlns:r="http://schemas.openxmlformats.org/officeDocument/2006/relationships">
+<w:hdr xmlns:wpc="http://schemas.microsoft.com/office/word/2010/wordprocessingCanvas" xmlns:mc="http://schemas.openxmlformats.org/markup-compatibility/2006" xmlns:o="urn:schemas-microsoft-com:office:office" xmlns:r="http://schemas.openxmlformats.org/officeDocument/2006/relationships" xmlns:m="http://schemas.openxmlformats.org/officeDocument/2006/math" xmlns:v="urn:schemas-microsoft-com:vml" xmlns:wp14="http://schemas.microsoft.com/office/word/2010/wordprocessingDrawing" xmlns:wp="http://schemas.openxmlformats.org/drawingml/2006/wordprocessingDrawing" xmlns:w10="urn:schemas-microsoft-com:office:word" xmlns:w="http://schemas.openxmlformats.org/wordprocessingml/2006/main" xmlns:w14="http://schemas.microsoft.com/office/word/2010/wordml" xmlns:w15="http://schemas.microsoft.com/office/word/2012/wordml" xmlns:wpg="http://schemas.microsoft.com/office/word/2010/wordprocessingGroup" xmlns:wpi="http://schemas.microsoft.com/office/word/2010/wordprocessingInk" xmlns:wne="http://schemas.microsoft.com/office/word/2006/wordml" xmlns:wps="http://schemas.microsoft.com/office/word/2010/wordprocessingShape">
   <w:p>
     <w:pPr>
       <w:jc w:val="center"/>

</xml_diff>